<commit_message>
search icon functionality integration
</commit_message>
<xml_diff>
--- a/Ceramika_Development_Summary.docx
+++ b/Ceramika_Development_Summary.docx
@@ -181,6 +181,24 @@
       </w:r>
       <w:r>
         <w:t>Short for 'properties'. It's how we pass instructions to a component. For example, passing theme='dark' to the Footer tells the Footer to render itself with dark colors.</w:t>
+      </w:r>
+    </w:p>
+    <w:p>
+      <w:pPr>
+        <w:pStyle w:val="Heading2"/>
+      </w:pPr>
+      <w:r>
+        <w:t>Additional Feature: Global Search Modal</w:t>
+      </w:r>
+    </w:p>
+    <w:p>
+      <w:pPr>
+        <w:pStyle w:val="ListBullet"/>
+      </w:pPr>
+      <w:r>
+        <w:t>6. Full-Screen Search Overlay:</w:t>
+        <w:br/>
+        <w:t>Implemented a highly responsive, full-screen search overlay triggered by the search icon in the Navbar. The search fetches the product database and allows real-time filtering by product name, SKU, or finish (e.g., 'Marble'). This creates a seamless, premium e-commerce search experience without requiring page reloads.</w:t>
       </w:r>
     </w:p>
     <w:sectPr>

</xml_diff>

<commit_message>
admin page UI redesign and functionality update
</commit_message>
<xml_diff>
--- a/Ceramika_Development_Summary.docx
+++ b/Ceramika_Development_Summary.docx
@@ -199,6 +199,96 @@
         <w:t>6. Full-Screen Search Overlay:</w:t>
         <w:br/>
         <w:t>Implemented a highly responsive, full-screen search overlay triggered by the search icon in the Navbar. The search fetches the product database and allows real-time filtering by product name, SKU, or finish (e.g., 'Marble'). This creates a seamless, premium e-commerce search experience without requiring page reloads.</w:t>
+      </w:r>
+    </w:p>
+    <w:p>
+      <w:pPr>
+        <w:pStyle w:val="Heading2"/>
+      </w:pPr>
+      <w:r>
+        <w:t>Additional Feature: Admin Dashboard Overhaul</w:t>
+      </w:r>
+    </w:p>
+    <w:p>
+      <w:pPr>
+        <w:pStyle w:val="ListBullet"/>
+      </w:pPr>
+      <w:r>
+        <w:t>7. Edit Product Modal:</w:t>
+        <w:br/>
+        <w:t>The Edit button on the admin table now opens a sleek modal pre-filled with the product's current data (name, effect, size, price, stock, carton details, image URL). On save it attempts a PUT request to the backend; if the endpoint isn't ready yet, it applies an optimistic local update and shows a toast notification.</w:t>
+      </w:r>
+    </w:p>
+    <w:p>
+      <w:pPr>
+        <w:pStyle w:val="ListBullet"/>
+      </w:pPr>
+      <w:r>
+        <w:t>8. Add New Product Modal:</w:t>
+        <w:br/>
+        <w:t>The '+ Add New Product' button now opens a clean form modal where the admin can enter all product details including SKU, name, effect (dropdown), size, pricing, stock, and image URL. Same optimistic approach as edit — tries the backend POST first, falls back to local.</w:t>
+      </w:r>
+    </w:p>
+    <w:p>
+      <w:pPr>
+        <w:pStyle w:val="ListBullet"/>
+      </w:pPr>
+      <w:r>
+        <w:t>9. Pagination:</w:t>
+        <w:br/>
+        <w:t>The product table now displays 10 items per page with numbered page controls at the bottom. The current page is highlighted in Ceramika gold (#c8a96e). A 'Showing X-Y of Z products' counter is displayed on the left.</w:t>
+      </w:r>
+    </w:p>
+    <w:p>
+      <w:pPr>
+        <w:pStyle w:val="Heading2"/>
+      </w:pPr>
+      <w:r>
+        <w:t>Additional Glossary Terms</w:t>
+      </w:r>
+    </w:p>
+    <w:p>
+      <w:r>
+        <w:rPr>
+          <w:b/>
+        </w:rPr>
+        <w:t xml:space="preserve">Optimistic UI Update: </w:t>
+      </w:r>
+      <w:r>
+        <w:t>When you click 'Save' in a form, the app immediately updates the screen without waiting for the server to respond. This makes the experience feel instant. If the server later fails, the app can show an error.</w:t>
+      </w:r>
+    </w:p>
+    <w:p>
+      <w:r>
+        <w:rPr>
+          <w:b/>
+        </w:rPr>
+        <w:t xml:space="preserve">Toast Notification: </w:t>
+      </w:r>
+      <w:r>
+        <w:t>A small, temporary message that pops up at the corner of the screen (like a piece of toast popping out of a toaster) to confirm an action succeeded or failed. It disappears after a few seconds.</w:t>
+      </w:r>
+    </w:p>
+    <w:p>
+      <w:r>
+        <w:rPr>
+          <w:b/>
+        </w:rPr>
+        <w:t xml:space="preserve">CRUD: </w:t>
+      </w:r>
+      <w:r>
+        <w:t>Stands for Create, Read, Update, Delete — the four basic operations you can perform on data. The admin page now supports all four.</w:t>
+      </w:r>
+    </w:p>
+    <w:p>
+      <w:r>
+        <w:rPr>
+          <w:b/>
+        </w:rPr>
+        <w:t xml:space="preserve">Modal: </w:t>
+      </w:r>
+      <w:r>
+        <w:t>A popup window that appears on top of the current page, dimming the background. It forces the user to interact with it before returning to the main content. Used here for Edit and Add forms.</w:t>
       </w:r>
     </w:p>
     <w:sectPr>

</xml_diff>